<commit_message>
Add premium admin journey command centre with full CRUD, sort, and notifications
- New journeys tab: active pinned top (green), past/cancelled in red, sortable by route/date/status
- Click any row opens detail drawer with all fields, match history, and action buttons
- Post Journey as Admin: Künle A Aluko profile, auto-verified, no Stripe required, goes active immediately
- Update journey: field selector (status/weight/price/date) with mandatory reason (min 10 chars)
- Cancel journey: cancels linked matches, emails all affected parties, mandatory reason required
- New API routes: /api/admin/journeys/create, /[id]/detail, /[id]/update, /[id]/delete
- dashboard-data route now fetches full trip rows via select('*')

Co-Authored-By: Claude Sonnet 4.6 <noreply@anthropic.com>
</commit_message>
<xml_diff>
--- a/docs/BOOTHOP_tASK.docx
+++ b/docs/BOOTHOP_tASK.docx
@@ -24,9 +24,58 @@
       </w:r>
     </w:p>
     <w:p/>
-    <w:p/>
     <w:p>
       <w:r>
+        <w:t>Keep safe — save this keystore info somewhere secure:</w:t>
+      </w:r>
+    </w:p>
+    <w:p>
+      <w:r>
+        <w:t xml:space="preserve">  File:     Downloads/</w:t>
+      </w:r>
+      <w:proofErr w:type="spellStart"/>
+      <w:r>
+        <w:t>boothop</w:t>
+      </w:r>
+      <w:proofErr w:type="spellEnd"/>
+      <w:r>
+        <w:t>-</w:t>
+      </w:r>
+      <w:proofErr w:type="spellStart"/>
+      <w:r>
+        <w:t>pwa</w:t>
+      </w:r>
+      <w:proofErr w:type="spellEnd"/>
+      <w:r>
+        <w:t>-extracted/</w:t>
+      </w:r>
+      <w:proofErr w:type="spellStart"/>
+      <w:r>
+        <w:t>signing.keystore</w:t>
+      </w:r>
+      <w:proofErr w:type="spellEnd"/>
+    </w:p>
+    <w:p>
+      <w:r>
+        <w:t xml:space="preserve">  Password: 9yyo7oCIhdnQ</w:t>
+      </w:r>
+    </w:p>
+    <w:p>
+      <w:r>
+        <w:t xml:space="preserve">  Alias:    my-key-alias</w:t>
+      </w:r>
+    </w:p>
+    <w:p>
+      <w:r>
+        <w:t xml:space="preserve">  You'll need it every time you publish an update.</w:t>
+      </w:r>
+    </w:p>
+    <w:p>
+      <w:r>
+        <w:rPr>
+          <w:noProof/>
+        </w:rPr>
+        <w:lastRenderedPageBreak/>
         <w:drawing>
           <wp:inline distT="0" distB="0" distL="0" distR="0" wp14:anchorId="402EB45D" wp14:editId="5ACA230F">
             <wp:extent cx="5112013" cy="6178868"/>
@@ -66,7 +115,6 @@
     </w:p>
     <w:p>
       <w:r>
-        <w:lastRenderedPageBreak/>
         <w:t xml:space="preserve"> 872621956046-3ujtmlr9rdm58uu4ulbqrb7gnrni1ttu.apps.googleusercontent.com   client id   </w:t>
       </w:r>
       <w:proofErr w:type="gramStart"/>

</xml_diff>